<commit_message>
fix: el backend normaliza el catalogo de estados al arrancar y CU-04 solo ofrece cancelar en casos cancelables
</commit_message>
<xml_diff>
--- a/docs/casos-de-uso-v2/CU-04 Cancelar Caso.docx
+++ b/docs/casos-de-uso-v2/CU-04 Cancelar Caso.docx
@@ -838,7 +838,7 @@
           <w:sz w:val="22"/>
           <w:szCs w:val="22"/>
         </w:rPr>
-        <w:t xml:space="preserve">En la pantalla “Mis casos” (CU-03), el usuario ubica el caso que desea cancelar. En las filas de los casos cancelables se muestra el botón “Cancelar caso” (FA01).</w:t>
+        <w:t xml:space="preserve">En la pantalla “Mis casos” (CU-03), el usuario ubica el caso que desea cancelar. El botón “Cancelar caso” solo se muestra en las filas de los casos cancelables, es decir, los que están en estado “Nuevo” o “En espera” y todavía no tienen un responsable asignado. En cualquier otro estado (En Proceso, Resuelto, Cerrado, Reapertura solicitada o Cancelado por el usuario) o cuando el caso ya tiene responsable, el sistema no muestra la opción y el usuario no puede cancelar el caso (FA01).</w:t>
       </w:r>
     </w:p>
     <w:p>
@@ -1308,7 +1308,7 @@
           <w:sz w:val="22"/>
           <w:szCs w:val="22"/>
         </w:rPr>
-        <w:t xml:space="preserve">FA01 – El caso ya está en atención:</w:t>
+        <w:t xml:space="preserve">FA01 – El caso ya está en atención y no puede cancelarse:</w:t>
       </w:r>
     </w:p>
     <w:p>
@@ -1326,7 +1326,7 @@
           <w:sz w:val="22"/>
           <w:szCs w:val="22"/>
         </w:rPr>
-        <w:t xml:space="preserve">El sistema detecta que el caso ya fue asignado o atendido (CU-07).</w:t>
+        <w:t xml:space="preserve">El caso ya fue asignado o atendido por el personal (CU-07). Normalmente la pantalla ya no muestra el botón “Cancelar caso”; el flujo ocurre si el caso cambió de estado mientras el usuario tenía abierta la lista, o si se intenta la cancelación por otra vía.</w:t>
       </w:r>
     </w:p>
     <w:p>
@@ -1344,7 +1344,25 @@
           <w:sz w:val="22"/>
           <w:szCs w:val="22"/>
         </w:rPr>
-        <w:t xml:space="preserve">El sistema no permite cancelarlo y muestra el mensaje: “El caso ya se encuentra en atención y no puede ser cancelado”.</w:t>
+        <w:t xml:space="preserve">El sistema detecta que el caso ya no es cancelable, no lo cancela y muestra el mensaje: “El caso ya se encuentra en atención y no puede ser cancelado”.</w:t>
+      </w:r>
+    </w:p>
+    <w:p>
+      <w:pPr>
+        <w:pStyle w:val="ListParagraph"/>
+        <w:numPr>
+          <w:ilvl w:val="0"/>
+          <w:numId w:val="4"/>
+        </w:numPr>
+        <w:spacing w:after="80"/>
+      </w:pPr>
+      <w:r>
+        <w:rPr>
+          <w:rFonts w:ascii="Calibri" w:cs="Calibri" w:eastAsia="Calibri" w:hAnsi="Calibri"/>
+          <w:sz w:val="22"/>
+          <w:szCs w:val="22"/>
+        </w:rPr>
+        <w:t xml:space="preserve">La cancelación nunca se realiza sobre un caso en atención: el servidor la rechaza aunque la pantalla se manipule.</w:t>
       </w:r>
     </w:p>
     <w:p>
@@ -1608,7 +1626,7 @@
           <w:sz w:val="22"/>
           <w:szCs w:val="22"/>
         </w:rPr>
-        <w:t xml:space="preserve">Solo pueden cancelarse casos que no hayan iniciado su atención.</w:t>
+        <w:t xml:space="preserve">Solo pueden cancelarse casos que no hayan iniciado su atención: la pantalla no ofrece la opción en los demás estados y el servidor rechaza cualquier intento.</w:t>
       </w:r>
     </w:p>
     <w:p>

</xml_diff>